<commit_message>
Remove deprecated real name for light
</commit_message>
<xml_diff>
--- a/install.docx
+++ b/install.docx
@@ -1,6 +1,6 @@
 
 <file path=word/document.xml><?xml version="1.0" encoding="utf-8"?>
-<w:document xmlns:wpc="http://schemas.microsoft.com/office/word/2010/wordprocessingCanvas" xmlns:cx="http://schemas.microsoft.com/office/drawing/2014/chartex" xmlns:cx1="http://schemas.microsoft.com/office/drawing/2015/9/8/chartex" xmlns:cx2="http://schemas.microsoft.com/office/drawing/2015/10/21/chartex" xmlns:cx3="http://schemas.microsoft.com/office/drawing/2016/5/9/chartex" xmlns:cx4="http://schemas.microsoft.com/office/drawing/2016/5/10/chartex" xmlns:cx5="http://schemas.microsoft.com/office/drawing/2016/5/11/chartex" xmlns:cx6="http://schemas.microsoft.com/office/drawing/2016/5/12/chartex" xmlns:cx7="http://schemas.microsoft.com/office/drawing/2016/5/13/chartex" xmlns:cx8="http://schemas.microsoft.com/office/drawing/2016/5/14/chartex" xmlns:mc="http://schemas.openxmlformats.org/markup-compatibility/2006" xmlns:aink="http://schemas.microsoft.com/office/drawing/2016/ink" xmlns:am3d="http://schemas.microsoft.com/office/drawing/2017/model3d" xmlns:o="urn:schemas-microsoft-com:office:office" xmlns:oel="http://schemas.microsoft.com/office/2019/extlst" xmlns:r="http://schemas.openxmlformats.org/officeDocument/2006/relationships" xmlns:m="http://schemas.openxmlformats.org/officeDocument/2006/math" xmlns:v="urn:schemas-microsoft-com:vml" xmlns:wp14="http://schemas.microsoft.com/office/word/2010/wordprocessingDrawing" xmlns:wp="http://schemas.openxmlformats.org/drawingml/2006/wordprocessingDrawing" xmlns:w10="urn:schemas-microsoft-com:office:word" xmlns:w="http://schemas.openxmlformats.org/wordprocessingml/2006/main" xmlns:w14="http://schemas.microsoft.com/office/word/2010/wordml" xmlns:w15="http://schemas.microsoft.com/office/word/2012/wordml" xmlns:w16cex="http://schemas.microsoft.com/office/word/2018/wordml/cex" xmlns:w16cid="http://schemas.microsoft.com/office/word/2016/wordml/cid" xmlns:w16="http://schemas.microsoft.com/office/word/2018/wordml" xmlns:w16du="http://schemas.microsoft.com/office/word/2023/wordml/word16du" xmlns:w16sdtdh="http://schemas.microsoft.com/office/word/2020/wordml/sdtdatahash" xmlns:w16se="http://schemas.microsoft.com/office/word/2015/wordml/symex" xmlns:wpg="http://schemas.microsoft.com/office/word/2010/wordprocessingGroup" xmlns:wpi="http://schemas.microsoft.com/office/word/2010/wordprocessingInk" xmlns:wne="http://schemas.microsoft.com/office/word/2006/wordml" xmlns:wps="http://schemas.microsoft.com/office/word/2010/wordprocessingShape" mc:Ignorable="w14 w15 w16se w16cid w16 w16cex w16sdtdh w16du wp14">
+<w:document xmlns:wpc="http://schemas.microsoft.com/office/word/2010/wordprocessingCanvas" xmlns:cx="http://schemas.microsoft.com/office/drawing/2014/chartex" xmlns:cx1="http://schemas.microsoft.com/office/drawing/2015/9/8/chartex" xmlns:cx2="http://schemas.microsoft.com/office/drawing/2015/10/21/chartex" xmlns:cx3="http://schemas.microsoft.com/office/drawing/2016/5/9/chartex" xmlns:cx4="http://schemas.microsoft.com/office/drawing/2016/5/10/chartex" xmlns:cx5="http://schemas.microsoft.com/office/drawing/2016/5/11/chartex" xmlns:cx6="http://schemas.microsoft.com/office/drawing/2016/5/12/chartex" xmlns:cx7="http://schemas.microsoft.com/office/drawing/2016/5/13/chartex" xmlns:cx8="http://schemas.microsoft.com/office/drawing/2016/5/14/chartex" xmlns:mc="http://schemas.openxmlformats.org/markup-compatibility/2006" xmlns:aink="http://schemas.microsoft.com/office/drawing/2016/ink" xmlns:am3d="http://schemas.microsoft.com/office/drawing/2017/model3d" xmlns:o="urn:schemas-microsoft-com:office:office" xmlns:oel="http://schemas.microsoft.com/office/2019/extlst" xmlns:r="http://schemas.openxmlformats.org/officeDocument/2006/relationships" xmlns:m="http://schemas.openxmlformats.org/officeDocument/2006/math" xmlns:v="urn:schemas-microsoft-com:vml" xmlns:wp14="http://schemas.microsoft.com/office/word/2010/wordprocessingDrawing" xmlns:wp="http://schemas.openxmlformats.org/drawingml/2006/wordprocessingDrawing" xmlns:w10="urn:schemas-microsoft-com:office:word" xmlns:w="http://schemas.openxmlformats.org/wordprocessingml/2006/main" xmlns:w14="http://schemas.microsoft.com/office/word/2010/wordml" xmlns:w15="http://schemas.microsoft.com/office/word/2012/wordml" xmlns:w16cex="http://schemas.microsoft.com/office/word/2018/wordml/cex" xmlns:w16cid="http://schemas.microsoft.com/office/word/2016/wordml/cid" xmlns:w16="http://schemas.microsoft.com/office/word/2018/wordml" xmlns:w16du="http://schemas.microsoft.com/office/word/2023/wordml/word16du" xmlns:w16sdtdh="http://schemas.microsoft.com/office/word/2020/wordml/sdtdatahash" xmlns:w16sdtfl="http://schemas.microsoft.com/office/word/2024/wordml/sdtformatlock" xmlns:w16se="http://schemas.microsoft.com/office/word/2015/wordml/symex" xmlns:wpg="http://schemas.microsoft.com/office/word/2010/wordprocessingGroup" xmlns:wpi="http://schemas.microsoft.com/office/word/2010/wordprocessingInk" xmlns:wne="http://schemas.microsoft.com/office/word/2006/wordml" xmlns:wps="http://schemas.microsoft.com/office/word/2010/wordprocessingShape" mc:Ignorable="w14 w15 w16se w16cid w16 w16cex w16sdtdh w16sdtfl w16du wp14">
   <w:body>
     <w:p>
       <w:pPr>
@@ -12,7 +12,10 @@
     </w:p>
     <w:p>
       <w:r>
-        <w:t>ID : ETU</w:t>
+        <w:t xml:space="preserve">ID : </w:t>
+      </w:r>
+      <w:r>
+        <w:t>etu</w:t>
       </w:r>
     </w:p>
     <w:p>
@@ -139,12 +142,12 @@
           <w:numId w:val="1"/>
         </w:numPr>
         <w:rPr>
-          <w:lang w:val="en-US"/>
-        </w:rPr>
-      </w:pPr>
-      <w:r>
-        <w:rPr>
-          <w:lang w:val="en-US"/>
+          <w:lang w:val="es-ES"/>
+        </w:rPr>
+      </w:pPr>
+      <w:r>
+        <w:rPr>
+          <w:lang w:val="es-ES"/>
         </w:rPr>
         <w:t>curl -SsL https://packages.httpie.io/deb/KEY.gpg | sudo gpg --dearmor -o /usr/share/keyrings/httpie.gpg</w:t>
       </w:r>
@@ -159,7 +162,7 @@
       </w:pPr>
       <w:r>
         <w:rPr>
-          <w:lang w:val="en-US"/>
+          <w:lang w:val="es-ES"/>
         </w:rPr>
         <w:t xml:space="preserve">sudo echo "deb [arch=amd64 signed-by=/usr/share/keyrings/httpie.gpg] </w:t>
       </w:r>
@@ -167,7 +170,7 @@
         <w:r>
           <w:rPr>
             <w:rStyle w:val="Lienhypertexte"/>
-            <w:lang w:val="en-US"/>
+            <w:lang w:val="es-ES"/>
           </w:rPr>
           <w:t>https://packages.httpie.io/deb ./</w:t>
         </w:r>
@@ -229,7 +232,19 @@
           <w:rPr>
             <w:rStyle w:val="Lienhypertexte"/>
           </w:rPr>
-          <w:t>https://raspberry-projects.com/pi/programming-in-c/io-pins/bcm2835-by-mike-mccauley</w:t>
+          <w:t>https://raspberry-projects.com/pi/programm</w:t>
+        </w:r>
+        <w:r>
+          <w:rPr>
+            <w:rStyle w:val="Lienhypertexte"/>
+          </w:rPr>
+          <w:t>i</w:t>
+        </w:r>
+        <w:r>
+          <w:rPr>
+            <w:rStyle w:val="Lienhypertexte"/>
+          </w:rPr>
+          <w:t>ng-in-c/io-pins/bcm2835-by-mike-mccauley</w:t>
         </w:r>
       </w:hyperlink>
     </w:p>
@@ -274,7 +289,19 @@
           <w:rPr>
             <w:rStyle w:val="Lienhypertexte"/>
           </w:rPr>
-          <w:t>https://github.com/AvidsenRD/TP_Polytech</w:t>
+          <w:t>https://github.com/AvidsenR</w:t>
+        </w:r>
+        <w:r>
+          <w:rPr>
+            <w:rStyle w:val="Lienhypertexte"/>
+          </w:rPr>
+          <w:t>D</w:t>
+        </w:r>
+        <w:r>
+          <w:rPr>
+            <w:rStyle w:val="Lienhypertexte"/>
+          </w:rPr>
+          <w:t>/TP_Polytech</w:t>
         </w:r>
       </w:hyperlink>
     </w:p>
@@ -1536,24 +1563,7 @@
           </w:tcPr>
           <w:p>
             <w:r>
-              <w:t>light/light_2ch/IDmaison0</w:t>
-            </w:r>
-          </w:p>
-          <w:p>
-            <w:r>
-              <w:rPr>
-                <w:b/>
-              </w:rPr>
-              <w:t xml:space="preserve">ou </w:t>
-            </w:r>
-            <w:r>
-              <w:t>light/</w:t>
-            </w:r>
-            <w:r>
-              <w:t xml:space="preserve"> </w:t>
-            </w:r>
-            <w:r>
-              <w:t>2ch/IDmaison0</w:t>
+              <w:t>light/2ch/IDmaison0</w:t>
             </w:r>
           </w:p>
         </w:tc>
@@ -1667,7 +1677,10 @@
           </w:tcPr>
           <w:p>
             <w:r>
-              <w:t>Light/light_rgb/IDmaison2</w:t>
+              <w:t>l</w:t>
+            </w:r>
+            <w:r>
+              <w:t>ight/light_rgb/IDmaison2</w:t>
             </w:r>
           </w:p>
         </w:tc>
@@ -3331,7 +3344,7 @@
 </file>
 
 <file path=word/numbering.xml><?xml version="1.0" encoding="utf-8"?>
-<w:numbering xmlns:wpc="http://schemas.microsoft.com/office/word/2010/wordprocessingCanvas" xmlns:cx="http://schemas.microsoft.com/office/drawing/2014/chartex" xmlns:cx1="http://schemas.microsoft.com/office/drawing/2015/9/8/chartex" xmlns:cx2="http://schemas.microsoft.com/office/drawing/2015/10/21/chartex" xmlns:cx3="http://schemas.microsoft.com/office/drawing/2016/5/9/chartex" xmlns:cx4="http://schemas.microsoft.com/office/drawing/2016/5/10/chartex" xmlns:cx5="http://schemas.microsoft.com/office/drawing/2016/5/11/chartex" xmlns:cx6="http://schemas.microsoft.com/office/drawing/2016/5/12/chartex" xmlns:cx7="http://schemas.microsoft.com/office/drawing/2016/5/13/chartex" xmlns:cx8="http://schemas.microsoft.com/office/drawing/2016/5/14/chartex" xmlns:mc="http://schemas.openxmlformats.org/markup-compatibility/2006" xmlns:aink="http://schemas.microsoft.com/office/drawing/2016/ink" xmlns:am3d="http://schemas.microsoft.com/office/drawing/2017/model3d" xmlns:o="urn:schemas-microsoft-com:office:office" xmlns:oel="http://schemas.microsoft.com/office/2019/extlst" xmlns:r="http://schemas.openxmlformats.org/officeDocument/2006/relationships" xmlns:m="http://schemas.openxmlformats.org/officeDocument/2006/math" xmlns:v="urn:schemas-microsoft-com:vml" xmlns:wp14="http://schemas.microsoft.com/office/word/2010/wordprocessingDrawing" xmlns:wp="http://schemas.openxmlformats.org/drawingml/2006/wordprocessingDrawing" xmlns:w10="urn:schemas-microsoft-com:office:word" xmlns:w="http://schemas.openxmlformats.org/wordprocessingml/2006/main" xmlns:w14="http://schemas.microsoft.com/office/word/2010/wordml" xmlns:w15="http://schemas.microsoft.com/office/word/2012/wordml" xmlns:w16cex="http://schemas.microsoft.com/office/word/2018/wordml/cex" xmlns:w16cid="http://schemas.microsoft.com/office/word/2016/wordml/cid" xmlns:w16="http://schemas.microsoft.com/office/word/2018/wordml" xmlns:w16du="http://schemas.microsoft.com/office/word/2023/wordml/word16du" xmlns:w16sdtdh="http://schemas.microsoft.com/office/word/2020/wordml/sdtdatahash" xmlns:w16se="http://schemas.microsoft.com/office/word/2015/wordml/symex" xmlns:wpg="http://schemas.microsoft.com/office/word/2010/wordprocessingGroup" xmlns:wpi="http://schemas.microsoft.com/office/word/2010/wordprocessingInk" xmlns:wne="http://schemas.microsoft.com/office/word/2006/wordml" xmlns:wps="http://schemas.microsoft.com/office/word/2010/wordprocessingShape" mc:Ignorable="w14 w15 w16se w16cid w16 w16cex w16sdtdh w16du wp14">
+<w:numbering xmlns:wpc="http://schemas.microsoft.com/office/word/2010/wordprocessingCanvas" xmlns:cx="http://schemas.microsoft.com/office/drawing/2014/chartex" xmlns:cx1="http://schemas.microsoft.com/office/drawing/2015/9/8/chartex" xmlns:cx2="http://schemas.microsoft.com/office/drawing/2015/10/21/chartex" xmlns:cx3="http://schemas.microsoft.com/office/drawing/2016/5/9/chartex" xmlns:cx4="http://schemas.microsoft.com/office/drawing/2016/5/10/chartex" xmlns:cx5="http://schemas.microsoft.com/office/drawing/2016/5/11/chartex" xmlns:cx6="http://schemas.microsoft.com/office/drawing/2016/5/12/chartex" xmlns:cx7="http://schemas.microsoft.com/office/drawing/2016/5/13/chartex" xmlns:cx8="http://schemas.microsoft.com/office/drawing/2016/5/14/chartex" xmlns:mc="http://schemas.openxmlformats.org/markup-compatibility/2006" xmlns:aink="http://schemas.microsoft.com/office/drawing/2016/ink" xmlns:am3d="http://schemas.microsoft.com/office/drawing/2017/model3d" xmlns:o="urn:schemas-microsoft-com:office:office" xmlns:oel="http://schemas.microsoft.com/office/2019/extlst" xmlns:r="http://schemas.openxmlformats.org/officeDocument/2006/relationships" xmlns:m="http://schemas.openxmlformats.org/officeDocument/2006/math" xmlns:v="urn:schemas-microsoft-com:vml" xmlns:wp14="http://schemas.microsoft.com/office/word/2010/wordprocessingDrawing" xmlns:wp="http://schemas.openxmlformats.org/drawingml/2006/wordprocessingDrawing" xmlns:w10="urn:schemas-microsoft-com:office:word" xmlns:w="http://schemas.openxmlformats.org/wordprocessingml/2006/main" xmlns:w14="http://schemas.microsoft.com/office/word/2010/wordml" xmlns:w15="http://schemas.microsoft.com/office/word/2012/wordml" xmlns:w16cex="http://schemas.microsoft.com/office/word/2018/wordml/cex" xmlns:w16cid="http://schemas.microsoft.com/office/word/2016/wordml/cid" xmlns:w16="http://schemas.microsoft.com/office/word/2018/wordml" xmlns:w16du="http://schemas.microsoft.com/office/word/2023/wordml/word16du" xmlns:w16sdtdh="http://schemas.microsoft.com/office/word/2020/wordml/sdtdatahash" xmlns:w16sdtfl="http://schemas.microsoft.com/office/word/2024/wordml/sdtformatlock" xmlns:w16se="http://schemas.microsoft.com/office/word/2015/wordml/symex" xmlns:wpg="http://schemas.microsoft.com/office/word/2010/wordprocessingGroup" xmlns:wpi="http://schemas.microsoft.com/office/word/2010/wordprocessingInk" xmlns:wne="http://schemas.microsoft.com/office/word/2006/wordml" xmlns:wps="http://schemas.microsoft.com/office/word/2010/wordprocessingShape" mc:Ignorable="w14 w15 w16se w16cid w16 w16cex w16sdtdh w16sdtfl w16du wp14">
   <w:abstractNum w:abstractNumId="0" w15:restartNumberingAfterBreak="0">
     <w:nsid w:val="4A7D64E8"/>
     <w:multiLevelType w:val="hybridMultilevel"/>
@@ -3566,7 +3579,7 @@
 </file>
 
 <file path=word/styles.xml><?xml version="1.0" encoding="utf-8"?>
-<w:styles xmlns:mc="http://schemas.openxmlformats.org/markup-compatibility/2006" xmlns:r="http://schemas.openxmlformats.org/officeDocument/2006/relationships" xmlns:w="http://schemas.openxmlformats.org/wordprocessingml/2006/main" xmlns:w14="http://schemas.microsoft.com/office/word/2010/wordml" xmlns:w15="http://schemas.microsoft.com/office/word/2012/wordml" xmlns:w16cex="http://schemas.microsoft.com/office/word/2018/wordml/cex" xmlns:w16cid="http://schemas.microsoft.com/office/word/2016/wordml/cid" xmlns:w16="http://schemas.microsoft.com/office/word/2018/wordml" xmlns:w16du="http://schemas.microsoft.com/office/word/2023/wordml/word16du" xmlns:w16sdtdh="http://schemas.microsoft.com/office/word/2020/wordml/sdtdatahash" xmlns:w16se="http://schemas.microsoft.com/office/word/2015/wordml/symex" mc:Ignorable="w14 w15 w16se w16cid w16 w16cex w16sdtdh w16du">
+<w:styles xmlns:mc="http://schemas.openxmlformats.org/markup-compatibility/2006" xmlns:r="http://schemas.openxmlformats.org/officeDocument/2006/relationships" xmlns:w="http://schemas.openxmlformats.org/wordprocessingml/2006/main" xmlns:w14="http://schemas.microsoft.com/office/word/2010/wordml" xmlns:w15="http://schemas.microsoft.com/office/word/2012/wordml" xmlns:w16cex="http://schemas.microsoft.com/office/word/2018/wordml/cex" xmlns:w16cid="http://schemas.microsoft.com/office/word/2016/wordml/cid" xmlns:w16="http://schemas.microsoft.com/office/word/2018/wordml" xmlns:w16du="http://schemas.microsoft.com/office/word/2023/wordml/word16du" xmlns:w16sdtdh="http://schemas.microsoft.com/office/word/2020/wordml/sdtdatahash" xmlns:w16sdtfl="http://schemas.microsoft.com/office/word/2024/wordml/sdtformatlock" xmlns:w16se="http://schemas.microsoft.com/office/word/2015/wordml/symex" mc:Ignorable="w14 w15 w16se w16cid w16 w16cex w16sdtdh w16sdtfl w16du">
   <w:docDefaults>
     <w:rPrDefault>
       <w:rPr>
@@ -4168,6 +4181,7 @@
   <w:style w:type="character" w:default="1" w:styleId="Policepardfaut">
     <w:name w:val="Default Paragraph Font"/>
     <w:uiPriority w:val="1"/>
+    <w:semiHidden/>
     <w:unhideWhenUsed/>
   </w:style>
   <w:style w:type="table" w:default="1" w:styleId="TableauNormal">

</xml_diff>